<commit_message>
Personalize Word lab manual reports for Smit Popat (D26DCE173) with updated GitHub repository and generate reports for Practicals 13-15
</commit_message>
<xml_diff>
--- a/WD/WORD FILES/D26DCE173-Practical-10.docx
+++ b/WD/WORD FILES/D26DCE173-Practical-10.docx
@@ -2029,50 +2029,7 @@
         <w:ind w:right="356"/>
       </w:pPr>
       <w:r>
-        <w:rPr>
-          <w:color w:val="333333"/>
-        </w:rPr>
-        <w:t>Student user credential input interface following</w:t>
-      </w:r>
-      <w:r>
-        <w:rPr>
-          <w:color w:val="333333"/>
-          <w:spacing w:val="-1"/>
-        </w:rPr>
-        <w:t> </w:t>
-      </w:r>
-      <w:r>
-        <w:rPr>
-          <w:color w:val="333333"/>
-        </w:rPr>
-        <w:t>account creation (Student ID:</w:t>
-      </w:r>
-      <w:r>
-        <w:rPr>
-          <w:color w:val="333333"/>
-          <w:spacing w:val="-2"/>
-        </w:rPr>
-        <w:t> </w:t>
-      </w:r>
-      <w:r>
-        <w:rPr>
-          <w:color w:val="333333"/>
-        </w:rPr>
-        <w:t>STU-033). The student enters their registered academic email (</w:t>
-      </w:r>
-      <w:hyperlink r:id="rId7">
-        <w:r>
-          <w:rPr>
-            <w:color w:val="333333"/>
-          </w:rPr>
-          <w:t>'ved@gmail.com'</w:t>
-        </w:r>
-      </w:hyperlink>
-      <w:r>
-        <w:rPr>
-          <w:color w:val="333333"/>
-        </w:rPr>
-        <w:t>) and password into the authentication form to request access to the student portal.</w:t>
+        <w:t>Student user credential input interface following account creation (Student ID: D26DCE173). The student enters their registered academic email ('smit.popat@charusat.edu.in') and password into the authentication form to request access to the student portal.</w:t>
       </w:r>
     </w:p>
     <w:p>
@@ -2269,283 +2226,7 @@
         <w:ind w:right="355"/>
       </w:pPr>
       <w:r>
-        <w:rPr>
-          <w:color w:val="333333"/>
-        </w:rPr>
-        <w:t>Upon</w:t>
-      </w:r>
-      <w:r>
-        <w:rPr>
-          <w:color w:val="333333"/>
-          <w:spacing w:val="-1"/>
-        </w:rPr>
-        <w:t> </w:t>
-      </w:r>
-      <w:r>
-        <w:rPr>
-          <w:color w:val="333333"/>
-        </w:rPr>
-        <w:t>successful verification</w:t>
-      </w:r>
-      <w:r>
-        <w:rPr>
-          <w:color w:val="333333"/>
-          <w:spacing w:val="-1"/>
-        </w:rPr>
-        <w:t> </w:t>
-      </w:r>
-      <w:r>
-        <w:rPr>
-          <w:color w:val="333333"/>
-        </w:rPr>
-        <w:t>of</w:t>
-      </w:r>
-      <w:r>
-        <w:rPr>
-          <w:color w:val="333333"/>
-          <w:spacing w:val="-2"/>
-        </w:rPr>
-        <w:t> </w:t>
-      </w:r>
-      <w:r>
-        <w:rPr>
-          <w:color w:val="333333"/>
-        </w:rPr>
-        <w:t>student</w:t>
-      </w:r>
-      <w:r>
-        <w:rPr>
-          <w:color w:val="333333"/>
-          <w:spacing w:val="-2"/>
-        </w:rPr>
-        <w:t> </w:t>
-      </w:r>
-      <w:r>
-        <w:rPr>
-          <w:color w:val="333333"/>
-        </w:rPr>
-        <w:t>credentials,</w:t>
-      </w:r>
-      <w:r>
-        <w:rPr>
-          <w:color w:val="333333"/>
-          <w:spacing w:val="-2"/>
-        </w:rPr>
-        <w:t> </w:t>
-      </w:r>
-      <w:r>
-        <w:rPr>
-          <w:color w:val="333333"/>
-        </w:rPr>
-        <w:t>the</w:t>
-      </w:r>
-      <w:r>
-        <w:rPr>
-          <w:color w:val="333333"/>
-          <w:spacing w:val="-1"/>
-        </w:rPr>
-        <w:t> </w:t>
-      </w:r>
-      <w:r>
-        <w:rPr>
-          <w:color w:val="333333"/>
-        </w:rPr>
-        <w:t>server</w:t>
-      </w:r>
-      <w:r>
-        <w:rPr>
-          <w:color w:val="333333"/>
-          <w:spacing w:val="-2"/>
-        </w:rPr>
-        <w:t> </w:t>
-      </w:r>
-      <w:r>
-        <w:rPr>
-          <w:color w:val="333333"/>
-        </w:rPr>
-        <w:t>creates</w:t>
-      </w:r>
-      <w:r>
-        <w:rPr>
-          <w:color w:val="333333"/>
-          <w:spacing w:val="-1"/>
-        </w:rPr>
-        <w:t> </w:t>
-      </w:r>
-      <w:r>
-        <w:rPr>
-          <w:color w:val="333333"/>
-        </w:rPr>
-        <w:t>the</w:t>
-      </w:r>
-      <w:r>
-        <w:rPr>
-          <w:color w:val="333333"/>
-          <w:spacing w:val="-1"/>
-        </w:rPr>
-        <w:t> </w:t>
-      </w:r>
-      <w:r>
-        <w:rPr>
-          <w:color w:val="333333"/>
-        </w:rPr>
-        <w:t>authenticated</w:t>
-      </w:r>
-      <w:r>
-        <w:rPr>
-          <w:color w:val="333333"/>
-          <w:spacing w:val="-1"/>
-        </w:rPr>
-        <w:t> </w:t>
-      </w:r>
-      <w:r>
-        <w:rPr>
-          <w:color w:val="333333"/>
-        </w:rPr>
-        <w:t>student</w:t>
-      </w:r>
-      <w:r>
-        <w:rPr>
-          <w:color w:val="333333"/>
-          <w:spacing w:val="-2"/>
-        </w:rPr>
-        <w:t> </w:t>
-      </w:r>
-      <w:r>
-        <w:rPr>
-          <w:color w:val="333333"/>
-        </w:rPr>
-        <w:t>session</w:t>
-      </w:r>
-      <w:r>
-        <w:rPr>
-          <w:color w:val="333333"/>
-          <w:spacing w:val="-1"/>
-        </w:rPr>
-        <w:t> </w:t>
-      </w:r>
-      <w:r>
-        <w:rPr>
-          <w:color w:val="333333"/>
-        </w:rPr>
-        <w:t>and routes the user to 'student-dashboard.html'. The dashboard displays the verified user badge ('ved Student', avatar</w:t>
-      </w:r>
-      <w:r>
-        <w:rPr>
-          <w:color w:val="333333"/>
-          <w:spacing w:val="-1"/>
-        </w:rPr>
-        <w:t> </w:t>
-      </w:r>
-      <w:r>
-        <w:rPr>
-          <w:color w:val="333333"/>
-        </w:rPr>
-        <w:t>'VS'),</w:t>
-      </w:r>
-      <w:r>
-        <w:rPr>
-          <w:color w:val="333333"/>
-          <w:spacing w:val="-2"/>
-        </w:rPr>
-        <w:t> </w:t>
-      </w:r>
-      <w:r>
-        <w:rPr>
-          <w:color w:val="333333"/>
-        </w:rPr>
-        <w:t>generated</w:t>
-      </w:r>
-      <w:r>
-        <w:rPr>
-          <w:color w:val="333333"/>
-          <w:spacing w:val="-2"/>
-        </w:rPr>
-        <w:t> </w:t>
-      </w:r>
-      <w:r>
-        <w:rPr>
-          <w:color w:val="333333"/>
-        </w:rPr>
-        <w:t>Student</w:t>
-      </w:r>
-      <w:r>
-        <w:rPr>
-          <w:color w:val="333333"/>
-          <w:spacing w:val="-1"/>
-        </w:rPr>
-        <w:t> </w:t>
-      </w:r>
-      <w:r>
-        <w:rPr>
-          <w:color w:val="333333"/>
-        </w:rPr>
-        <w:t>ID</w:t>
-      </w:r>
-      <w:r>
-        <w:rPr>
-          <w:color w:val="333333"/>
-          <w:spacing w:val="-1"/>
-        </w:rPr>
-        <w:t> </w:t>
-      </w:r>
-      <w:r>
-        <w:rPr>
-          <w:color w:val="333333"/>
-        </w:rPr>
-        <w:t>'(STU-033)',</w:t>
-      </w:r>
-      <w:r>
-        <w:rPr>
-          <w:color w:val="333333"/>
-          <w:spacing w:val="-1"/>
-        </w:rPr>
-        <w:t> </w:t>
-      </w:r>
-      <w:r>
-        <w:rPr>
-          <w:color w:val="333333"/>
-        </w:rPr>
-        <w:t>metrics for</w:t>
-      </w:r>
-      <w:r>
-        <w:rPr>
-          <w:color w:val="333333"/>
-          <w:spacing w:val="-3"/>
-        </w:rPr>
-        <w:t> </w:t>
-      </w:r>
-      <w:r>
-        <w:rPr>
-          <w:color w:val="333333"/>
-        </w:rPr>
-        <w:t>Registered Events</w:t>
-      </w:r>
-      <w:r>
-        <w:rPr>
-          <w:color w:val="333333"/>
-          <w:spacing w:val="-2"/>
-        </w:rPr>
-        <w:t> </w:t>
-      </w:r>
-      <w:r>
-        <w:rPr>
-          <w:color w:val="333333"/>
-        </w:rPr>
-        <w:t>(3 Upcoming),</w:t>
-      </w:r>
-      <w:r>
-        <w:rPr>
-          <w:color w:val="333333"/>
-          <w:spacing w:val="-2"/>
-        </w:rPr>
-        <w:t> </w:t>
-      </w:r>
-      <w:r>
-        <w:rPr>
-          <w:color w:val="333333"/>
-        </w:rPr>
-        <w:t>Pending Tasks, Attendance (92%), upcoming academic symposia, and a top-right logout trigger.</w:t>
+        <w:t>Upon successful verification of student credentials, the server creates the authenticated student session and routes the user to 'student-dashboard.html'. The dashboard displays the verified user badge ('Smit Popat', avatar 'VS'), generated Student ID '(D26DCE173)', metrics for Registered Events (3 Upcoming), Pending Tasks, Attendance (92%), upcoming academic symposia, and a top-right logout trigger.</w:t>
       </w:r>
     </w:p>
     <w:p>
@@ -2706,24 +2387,7 @@
         <w:ind w:right="359"/>
       </w:pPr>
       <w:r>
-        <w:rPr>
-          <w:color w:val="333333"/>
-        </w:rPr>
-        <w:t>Authentication interface with institutional administrator credentials (</w:t>
-      </w:r>
-      <w:hyperlink r:id="rId10">
-        <w:r>
-          <w:rPr>
-            <w:color w:val="333333"/>
-          </w:rPr>
-          <w:t>'admin@charusat.edu.in'</w:t>
-        </w:r>
-      </w:hyperlink>
-      <w:r>
-        <w:rPr>
-          <w:color w:val="333333"/>
-        </w:rPr>
-        <w:t>) entered alongside the master administrative password, initiating the privileged login sequence with role validation.</w:t>
+        <w:t>Authentication interface with institutional administrator credentials ('admin@charusat.ac.in') entered alongside the master administrative password, initiating the privileged login sequence with role validation.</w:t>
       </w:r>
     </w:p>
     <w:p>
@@ -3130,24 +2794,7 @@
         <w:ind w:right="356"/>
       </w:pPr>
       <w:r>
-        <w:rPr>
-          <w:color w:val="333333"/>
-        </w:rPr>
-        <w:t>Login screen showing the server-side error alert: 'Incorrect password entered. Please try again.' when password_verify() fails to match the submitted password against the stored bcrypt hash for student </w:t>
-      </w:r>
-      <w:hyperlink r:id="rId13">
-        <w:r>
-          <w:rPr>
-            <w:color w:val="333333"/>
-          </w:rPr>
-          <w:t>'roshan11@gmail.com'</w:t>
-        </w:r>
-      </w:hyperlink>
-      <w:r>
-        <w:rPr>
-          <w:color w:val="333333"/>
-        </w:rPr>
-        <w:t>. The system securely denies entry while preserving the entered username/email.</w:t>
+        <w:t>Login screen showing the server-side error alert: 'Incorrect password entered. Please try again.' when password_verify() fails to match the submitted password against the stored bcrypt hash for student 'smit.popat@charusat.edu.in'. The system securely denies entry while preserving the entered username/email.</w:t>
       </w:r>
     </w:p>
     <w:p>
@@ -6500,63 +6147,8 @@
         <w:spacing w:before="173"/>
       </w:pPr>
       <w:r>
-        <w:rPr>
-          <w:color w:val="333333"/>
-          <w:spacing w:val="-2"/>
-        </w:rPr>
-        <w:t>GitHub</w:t>
-      </w:r>
-      <w:r>
-        <w:rPr>
-          <w:color w:val="333333"/>
-          <w:spacing w:val="16"/>
-        </w:rPr>
-        <w:t> </w:t>
-      </w:r>
-      <w:r>
-        <w:rPr>
-          <w:color w:val="333333"/>
-          <w:spacing w:val="-2"/>
-        </w:rPr>
-        <w:t>Repository</w:t>
-      </w:r>
-      <w:r>
-        <w:rPr>
-          <w:color w:val="333333"/>
-          <w:spacing w:val="14"/>
-        </w:rPr>
-        <w:t> </w:t>
-      </w:r>
-      <w:r>
-        <w:rPr>
-          <w:color w:val="333333"/>
-          <w:spacing w:val="-2"/>
-        </w:rPr>
-        <w:t>URL:</w:t>
-      </w:r>
-      <w:r>
-        <w:rPr>
-          <w:color w:val="333333"/>
-          <w:spacing w:val="17"/>
-        </w:rPr>
-        <w:t> </w:t>
-      </w:r>
-      <w:hyperlink r:id="rId18">
-        <w:r>
-          <w:rPr>
-            <w:color w:val="333333"/>
-            <w:spacing w:val="-2"/>
-          </w:rPr>
-          <w:t>https://github.com/ombhoi/Student-</w:t>
-        </w:r>
-        <w:r>
-          <w:rPr>
-            <w:color w:val="333333"/>
-            <w:spacing w:val="-5"/>
-          </w:rPr>
-          <w:t>Hub</w:t>
-        </w:r>
-      </w:hyperlink>
+        <w:t>GitHub Repository URL: https://github.com/smit-2406/studenthub-website</w:t>
+      </w:r>
     </w:p>
     <w:p>
       <w:pPr>

</xml_diff>

<commit_message>
Update headers and credentials to D26DCE173 (Smit Popat) across all docx and pdf files
</commit_message>
<xml_diff>
--- a/WD/WORD FILES/D26DCE173-Practical-10.docx
+++ b/WD/WORD FILES/D26DCE173-Practical-10.docx
@@ -6318,7 +6318,7 @@
                               <w:spacing w:val="-2"/>
                               <w:sz w:val="21"/>
                             </w:rPr>
-                            <w:t>ID-NO:-D26DCE152</w:t>
+                            <w:t>ID-NO:-D26DCE173</w:t>
                           </w:r>
                         </w:p>
                       </w:txbxContent>
@@ -6358,7 +6358,7 @@
                         <w:spacing w:val="-2"/>
                         <w:sz w:val="21"/>
                       </w:rPr>
-                      <w:t>ID-NO:-D26DCE152</w:t>
+                      <w:t>ID-NO:-D26DCE173</w:t>
                     </w:r>
                   </w:p>
                 </w:txbxContent>

</xml_diff>